<commit_message>
feat(bloco12): implementar solicitacoes de EPI e reserva logica
</commit_message>
<xml_diff>
--- a/RFC-V1.md.docx
+++ b/RFC-V1.md.docx
@@ -1008,7 +1008,7 @@
         <w:jc w:val="both"/>
       </w:pPr>
       <w:r>
-        <w:t>Responsável por analisar e aprovar as solicitações de EPI realizadas pelos trabalhadores.</w:t>
+        <w:t>Acompanha as necessidades de EPI da sua equipe e as atividades executadas.</w:t>
       </w:r>
     </w:p>
     <w:p>
@@ -1018,7 +1018,7 @@
         <w:jc w:val="both"/>
       </w:pPr>
       <w:r>
-        <w:t>Pode ajustar quantidades, negar solicitações e registrar justificativas, garantindo controle sobre o consumo e aderência às atividades executadas.</w:t>
+        <w:t>A aprovação das solicitações de EPI não é do supervisor: é da Segurança do Trabalho (SST), que aprova, nega, ajusta quantidades e registra justificativas.</w:t>
       </w:r>
     </w:p>
     <w:p>
@@ -1071,6 +1071,16 @@
       </w:pPr>
       <w:r>
         <w:t>validação técnica dos EPIs;</w:t>
+      </w:r>
+    </w:p>
+    <w:p>
+      <w:pPr>
+        <w:pStyle w:val="Commarcadores"/>
+        <w:spacing w:line="360" w:lineRule="auto"/>
+        <w:ind w:left="357"/>
+      </w:pPr>
+      <w:r>
+        <w:t>aprovação das solicitações de EPI (aprovar, negar, ajustar quantidades e registrar justificativas);</w:t>
       </w:r>
     </w:p>
     <w:p>
@@ -1375,7 +1385,7 @@
         <w:ind w:left="357"/>
       </w:pPr>
       <w:r>
-        <w:t>Digitalizar o processo de solicitação e aprovação de EPIs pelos trabalhadores e supervisores;</w:t>
+        <w:t>Digitalizar o processo de solicitação de EPIs pelos trabalhadores e de aprovação pela Segurança do Trabalho;</w:t>
       </w:r>
     </w:p>
     <w:p>
@@ -3895,17 +3905,17 @@
         <w:rPr>
           <w:rFonts w:ascii="Times New Roman" w:eastAsia="Times New Roman" w:hAnsi="Times New Roman"/>
         </w:rPr>
-        <w:t>2. Aprovação do Supervisor</w:t>
-      </w:r>
-    </w:p>
-    <w:p>
-      <w:pPr>
-        <w:pStyle w:val="Commarcadores"/>
-        <w:spacing w:line="360" w:lineRule="auto"/>
-        <w:ind w:left="357"/>
-      </w:pPr>
-      <w:r>
-        <w:t>Supervisor recebe a solicitação;</w:t>
+        <w:t>2. Aprovação pela Segurança do Trabalho</w:t>
+      </w:r>
+    </w:p>
+    <w:p>
+      <w:pPr>
+        <w:pStyle w:val="Commarcadores"/>
+        <w:spacing w:line="360" w:lineRule="auto"/>
+        <w:ind w:left="357"/>
+      </w:pPr>
+      <w:r>
+        <w:t>A Segurança do Trabalho (SST) recebe a solicitação;</w:t>
       </w:r>
     </w:p>
     <w:p>

</xml_diff>